<commit_message>
Atualização de slides para a aula
</commit_message>
<xml_diff>
--- a/UNIUBE-PDI/Praticas/Lista de Atividades/Lista1_PDI.docx
+++ b/UNIUBE-PDI/Praticas/Lista de Atividades/Lista1_PDI.docx
@@ -124,13 +124,28 @@
         <w:spacing w:after="0"/>
       </w:pPr>
       <w:r>
-        <w:t xml:space="preserve">Calcule a densidade de pixels da imagem </w:t>
+        <w:t>Exibir</w:t>
+      </w:r>
+      <w:r>
+        <w:t xml:space="preserve"> a densidade de pixels da imagem </w:t>
       </w:r>
       <w:r>
         <w:rPr>
           <w:color w:val="00B050"/>
         </w:rPr>
-        <w:t>(Pode utilizar função pronta)</w:t>
+        <w:t>(Pode utilizar função pronta</w:t>
+      </w:r>
+      <w:r>
+        <w:rPr>
+          <w:color w:val="00B050"/>
+        </w:rPr>
+        <w:t>, ou procurar nos detalhes da imagem</w:t>
+      </w:r>
+      <w:r>
+        <w:rPr>
+          <w:color w:val="00B050"/>
+        </w:rPr>
+        <w:t>)</w:t>
       </w:r>
     </w:p>
     <w:p>
@@ -263,6 +278,74 @@
     </w:p>
     <w:p>
       <w:pPr>
+        <w:spacing w:after="0"/>
+      </w:pPr>
+    </w:p>
+    <w:p>
+      <w:pPr>
+        <w:pStyle w:val="PargrafodaLista"/>
+        <w:numPr>
+          <w:ilvl w:val="0"/>
+          <w:numId w:val="1"/>
+        </w:numPr>
+        <w:spacing w:after="0"/>
+      </w:pPr>
+      <w:r>
+        <w:t>Gere uma imagem artificial (na escala cinza), de modo a exibir um degradê dos níveis de cinza para uma profundidade de 8</w:t>
+      </w:r>
+      <w:r>
+        <w:t>-</w:t>
+      </w:r>
+      <w:r>
+        <w:t>bits (256x256).</w:t>
+      </w:r>
+    </w:p>
+    <w:p>
+      <w:pPr>
+        <w:pStyle w:val="PargrafodaLista"/>
+      </w:pPr>
+    </w:p>
+    <w:p>
+      <w:pPr>
+        <w:pStyle w:val="PargrafodaLista"/>
+        <w:numPr>
+          <w:ilvl w:val="0"/>
+          <w:numId w:val="1"/>
+        </w:numPr>
+      </w:pPr>
+      <w:r>
+        <w:t xml:space="preserve">Re-quantize a imagem gerada no exercício 3 para </w:t>
+      </w:r>
+      <w:r>
+        <w:t>para as profundidades de 1 à 8 bits</w:t>
+      </w:r>
+    </w:p>
+    <w:p>
+      <w:pPr>
+        <w:pStyle w:val="PargrafodaLista"/>
+        <w:spacing w:after="0"/>
+      </w:pPr>
+    </w:p>
+    <w:p>
+      <w:pPr>
+        <w:pStyle w:val="PargrafodaLista"/>
+        <w:numPr>
+          <w:ilvl w:val="0"/>
+          <w:numId w:val="1"/>
+        </w:numPr>
+        <w:spacing w:after="0"/>
+      </w:pPr>
+      <w:r>
+        <w:t>Crie 3 imagens artificiais com dimensões 300x300, a primeira deve exibir apenas a cor vermelho, a segunda apenas a cor verde e a terceira apenas a cor azul. Em sequência, misture as imagens criadas para produzir as cores Ciano, Magenta, Amarelo e Branco.</w:t>
+      </w:r>
+    </w:p>
+    <w:p>
+      <w:pPr>
+        <w:pStyle w:val="PargrafodaLista"/>
+      </w:pPr>
+    </w:p>
+    <w:p>
+      <w:pPr>
         <w:pStyle w:val="PargrafodaLista"/>
         <w:numPr>
           <w:ilvl w:val="1"/>
@@ -271,12 +354,40 @@
         <w:spacing w:after="0"/>
       </w:pPr>
       <w:r>
-        <w:t>Qual objetivo de alterar a quantidade de bits?</w:t>
-      </w:r>
-    </w:p>
-    <w:p>
-      <w:pPr>
-        <w:spacing w:after="0"/>
+        <w:t xml:space="preserve">Explique passo-a-passo do programa implementado. </w:t>
+      </w:r>
+    </w:p>
+    <w:p>
+      <w:pPr>
+        <w:pStyle w:val="PargrafodaLista"/>
+        <w:numPr>
+          <w:ilvl w:val="1"/>
+          <w:numId w:val="1"/>
+        </w:numPr>
+        <w:spacing w:after="0"/>
+      </w:pPr>
+      <w:r>
+        <w:t>Explique como as cores estão sendo formadas</w:t>
+      </w:r>
+    </w:p>
+    <w:p>
+      <w:pPr>
+        <w:pStyle w:val="PargrafodaLista"/>
+        <w:numPr>
+          <w:ilvl w:val="1"/>
+          <w:numId w:val="1"/>
+        </w:numPr>
+        <w:spacing w:after="0"/>
+      </w:pPr>
+      <w:r>
+        <w:t>Exiba as cores Ciano, Magenta, Amarelo e Branco.</w:t>
+      </w:r>
+    </w:p>
+    <w:p>
+      <w:pPr>
+        <w:pStyle w:val="PargrafodaLista"/>
+        <w:spacing w:after="0"/>
+        <w:ind w:left="1440"/>
       </w:pPr>
     </w:p>
     <w:p>
@@ -289,12 +400,13 @@
         <w:spacing w:after="0"/>
       </w:pPr>
       <w:r>
-        <w:t>Gere uma imagem artificial (na escala cinza), de modo a exibir um degradê dos níveis de cinza para uma profundidade de 8bits (256x256).</w:t>
-      </w:r>
-    </w:p>
-    <w:p>
-      <w:pPr>
-        <w:pStyle w:val="PargrafodaLista"/>
+        <w:t>Diferencie as escalas HSV, RGB e CYMK</w:t>
+      </w:r>
+    </w:p>
+    <w:p>
+      <w:pPr>
+        <w:pStyle w:val="PargrafodaLista"/>
+        <w:spacing w:after="0"/>
       </w:pPr>
     </w:p>
     <w:p>
@@ -304,12 +416,55 @@
           <w:ilvl w:val="0"/>
           <w:numId w:val="1"/>
         </w:numPr>
-      </w:pPr>
-      <w:r>
-        <w:t xml:space="preserve">Re-quantize a imagem gerada no exercício 3 para </w:t>
-      </w:r>
-      <w:r>
-        <w:t>para as profundidades de 1 à 8 bits</w:t>
+        <w:spacing w:after="0"/>
+      </w:pPr>
+      <w:r>
+        <w:t>Utilizando a imagem Lenna.png:</w:t>
+      </w:r>
+    </w:p>
+    <w:p>
+      <w:pPr>
+        <w:pStyle w:val="PargrafodaLista"/>
+        <w:numPr>
+          <w:ilvl w:val="1"/>
+          <w:numId w:val="1"/>
+        </w:numPr>
+        <w:spacing w:after="0"/>
+      </w:pPr>
+      <w:r>
+        <w:t>Separe e exiba cada um dos canais</w:t>
+      </w:r>
+      <w:r>
+        <w:t xml:space="preserve"> RGB</w:t>
+      </w:r>
+      <w:r>
+        <w:t xml:space="preserve"> da imagem</w:t>
+      </w:r>
+    </w:p>
+    <w:p>
+      <w:pPr>
+        <w:pStyle w:val="PargrafodaLista"/>
+        <w:numPr>
+          <w:ilvl w:val="1"/>
+          <w:numId w:val="1"/>
+        </w:numPr>
+        <w:spacing w:after="0"/>
+      </w:pPr>
+      <w:r>
+        <w:t xml:space="preserve">Exiba a imagem apenas com as camadas R+B, R+G, B+G  </w:t>
+      </w:r>
+    </w:p>
+    <w:p>
+      <w:pPr>
+        <w:pStyle w:val="PargrafodaLista"/>
+        <w:numPr>
+          <w:ilvl w:val="1"/>
+          <w:numId w:val="1"/>
+        </w:numPr>
+        <w:spacing w:after="0"/>
+      </w:pPr>
+      <w:r>
+        <w:t>Explique o resultado</w:t>
       </w:r>
     </w:p>
     <w:p>
@@ -328,13 +483,8 @@
         <w:spacing w:after="0"/>
       </w:pPr>
       <w:r>
-        <w:t>Crie 3 imagens artificiais com dimensões 300x300, a primeira deve exibir apenas a cor vermelho, a segunda apenas a cor verde e a terceira apenas a cor azul. Em sequência, misture as imagens criadas para produzir as cores Ciano, Magenta, Amarelo e Branco.</w:t>
-      </w:r>
-    </w:p>
-    <w:p>
-      <w:pPr>
-        <w:pStyle w:val="PargrafodaLista"/>
-      </w:pPr>
+        <w:t>Utilizando a imagem Lenna.png:</w:t>
+      </w:r>
     </w:p>
     <w:p>
       <w:pPr>
@@ -346,7 +496,7 @@
         <w:spacing w:after="0"/>
       </w:pPr>
       <w:r>
-        <w:t xml:space="preserve">Explique passo-a-passo do programa implementado. </w:t>
+        <w:t>Converta ela para o formato HSV</w:t>
       </w:r>
     </w:p>
     <w:p>
@@ -359,7 +509,7 @@
         <w:spacing w:after="0"/>
       </w:pPr>
       <w:r>
-        <w:t>Explique como as cores estão sendo formadas</w:t>
+        <w:t>Separe e exiba cada um dos canais da imagem</w:t>
       </w:r>
     </w:p>
     <w:p>
@@ -372,155 +522,10 @@
         <w:spacing w:after="0"/>
       </w:pPr>
       <w:r>
-        <w:t xml:space="preserve">Exiba as cores </w:t>
-      </w:r>
-      <w:r>
-        <w:t>Ciano, Magenta, Amarelo e Branco</w:t>
-      </w:r>
-      <w:r>
-        <w:t>.</w:t>
-      </w:r>
-    </w:p>
-    <w:p>
-      <w:pPr>
-        <w:pStyle w:val="PargrafodaLista"/>
-        <w:spacing w:after="0"/>
-        <w:ind w:left="1440"/>
-      </w:pPr>
-    </w:p>
-    <w:p>
-      <w:pPr>
-        <w:pStyle w:val="PargrafodaLista"/>
-        <w:numPr>
-          <w:ilvl w:val="0"/>
-          <w:numId w:val="1"/>
-        </w:numPr>
-        <w:spacing w:after="0"/>
-      </w:pPr>
-      <w:r>
-        <w:t>Diferencie as escalas HSV, RGB e CYMK</w:t>
-      </w:r>
-    </w:p>
-    <w:p>
-      <w:pPr>
-        <w:pStyle w:val="PargrafodaLista"/>
-        <w:spacing w:after="0"/>
-      </w:pPr>
-    </w:p>
-    <w:p>
-      <w:pPr>
-        <w:pStyle w:val="PargrafodaLista"/>
-        <w:numPr>
-          <w:ilvl w:val="0"/>
-          <w:numId w:val="1"/>
-        </w:numPr>
-        <w:spacing w:after="0"/>
-      </w:pPr>
-      <w:r>
-        <w:t>Utilizando a imagem Lenna.png:</w:t>
-      </w:r>
-    </w:p>
-    <w:p>
-      <w:pPr>
-        <w:pStyle w:val="PargrafodaLista"/>
-        <w:numPr>
-          <w:ilvl w:val="1"/>
-          <w:numId w:val="1"/>
-        </w:numPr>
-        <w:spacing w:after="0"/>
-      </w:pPr>
-      <w:r>
-        <w:t>Separe e exiba cada um dos canais</w:t>
-      </w:r>
-      <w:r>
-        <w:t xml:space="preserve"> RGB</w:t>
-      </w:r>
-      <w:r>
-        <w:t xml:space="preserve"> da imagem</w:t>
-      </w:r>
-    </w:p>
-    <w:p>
-      <w:pPr>
-        <w:pStyle w:val="PargrafodaLista"/>
-        <w:numPr>
-          <w:ilvl w:val="1"/>
-          <w:numId w:val="1"/>
-        </w:numPr>
-        <w:spacing w:after="0"/>
-      </w:pPr>
-      <w:r>
-        <w:t xml:space="preserve">Exiba a imagem apenas com as camadas R+B, R+G, B+G  </w:t>
-      </w:r>
-    </w:p>
-    <w:p>
-      <w:pPr>
-        <w:pStyle w:val="PargrafodaLista"/>
-        <w:numPr>
-          <w:ilvl w:val="1"/>
-          <w:numId w:val="1"/>
-        </w:numPr>
-        <w:spacing w:after="0"/>
-      </w:pPr>
-      <w:r>
         <w:t>Explique o resultado</w:t>
       </w:r>
-    </w:p>
-    <w:p>
-      <w:pPr>
-        <w:pStyle w:val="PargrafodaLista"/>
-        <w:spacing w:after="0"/>
-      </w:pPr>
-    </w:p>
-    <w:p>
-      <w:pPr>
-        <w:pStyle w:val="PargrafodaLista"/>
-        <w:numPr>
-          <w:ilvl w:val="0"/>
-          <w:numId w:val="1"/>
-        </w:numPr>
-        <w:spacing w:after="0"/>
-      </w:pPr>
-      <w:r>
-        <w:t>Utilizando a imagem Lenna.png:</w:t>
-      </w:r>
-    </w:p>
-    <w:p>
-      <w:pPr>
-        <w:pStyle w:val="PargrafodaLista"/>
-        <w:numPr>
-          <w:ilvl w:val="1"/>
-          <w:numId w:val="1"/>
-        </w:numPr>
-        <w:spacing w:after="0"/>
-      </w:pPr>
-      <w:r>
-        <w:t>Converta ela para o formato HSV</w:t>
-      </w:r>
-    </w:p>
-    <w:p>
-      <w:pPr>
-        <w:pStyle w:val="PargrafodaLista"/>
-        <w:numPr>
-          <w:ilvl w:val="1"/>
-          <w:numId w:val="1"/>
-        </w:numPr>
-        <w:spacing w:after="0"/>
-      </w:pPr>
-      <w:r>
-        <w:t>Separe e exiba cada um dos canais da imagem</w:t>
-      </w:r>
-    </w:p>
-    <w:p>
-      <w:pPr>
-        <w:pStyle w:val="PargrafodaLista"/>
-        <w:numPr>
-          <w:ilvl w:val="1"/>
-          <w:numId w:val="1"/>
-        </w:numPr>
-        <w:spacing w:after="0"/>
-      </w:pPr>
-      <w:r>
-        <w:t>Explique o resultado</w:t>
+      <w:r>
+        <w:t xml:space="preserve"> e cada uma das camadas</w:t>
       </w:r>
     </w:p>
     <w:p>

</xml_diff>